<commit_message>
Updated CONOPS and added my vision statement
</commit_message>
<xml_diff>
--- a/srDesign_CONOPS.docx
+++ b/srDesign_CONOPS.docx
@@ -75,10 +75,7 @@
         <w:jc w:val="right"/>
       </w:pPr>
       <w:r>
-        <w:t>CONOPS</w:t>
-      </w:r>
-      <w:r>
-        <w:t xml:space="preserve"> Document </w:t>
+        <w:t xml:space="preserve">CONOPS Document </w:t>
       </w:r>
     </w:p>
     <w:p>
@@ -114,17 +111,8 @@
           <w:rStyle w:val="IntenseEmphasis"/>
           <w:i/>
         </w:rPr>
-        <w:t xml:space="preserve">David </w:t>
-      </w:r>
-      <w:proofErr w:type="spellStart"/>
-      <w:r>
-        <w:rPr>
-          <w:rStyle w:val="IntenseEmphasis"/>
-          <w:i/>
-        </w:rPr>
-        <w:t>Jarman</w:t>
-      </w:r>
-      <w:proofErr w:type="spellEnd"/>
+        <w:t>David Jarman</w:t>
+      </w:r>
     </w:p>
     <w:p>
       <w:pPr>
@@ -141,17 +129,8 @@
           <w:rStyle w:val="IntenseEmphasis"/>
           <w:i/>
         </w:rPr>
-        <w:t xml:space="preserve">Kevin </w:t>
-      </w:r>
-      <w:proofErr w:type="spellStart"/>
-      <w:r>
-        <w:rPr>
-          <w:rStyle w:val="IntenseEmphasis"/>
-          <w:i/>
-        </w:rPr>
-        <w:t>Worner</w:t>
-      </w:r>
-      <w:proofErr w:type="spellEnd"/>
+        <w:t>Kevin Worner</w:t>
+      </w:r>
     </w:p>
     <w:p>
       <w:pPr>
@@ -418,25 +397,7 @@
           <w:sz w:val="16"/>
           <w:szCs w:val="16"/>
         </w:rPr>
-        <w:t>Typically a Process Model of one or more of the functions that the</w:t>
-      </w:r>
-      <w:r>
-        <w:rPr>
-          <w:rFonts w:ascii="CMSS12" w:hAnsi="CMSS12" w:cs="CMSS12"/>
-          <w:color w:val="000000" w:themeColor="text1"/>
-          <w:sz w:val="16"/>
-          <w:szCs w:val="16"/>
-        </w:rPr>
-        <w:t xml:space="preserve"> </w:t>
-      </w:r>
-      <w:r>
-        <w:rPr>
-          <w:rFonts w:ascii="CMSS12" w:hAnsi="CMSS12" w:cs="CMSS12"/>
-          <w:color w:val="000000" w:themeColor="text1"/>
-          <w:sz w:val="16"/>
-          <w:szCs w:val="16"/>
-        </w:rPr>
-        <w:t>system is supposed to perform</w:t>
+        <w:t>Typically a Process Model of one or more of the functions that the system is supposed to perform</w:t>
       </w:r>
     </w:p>
     <w:p>
@@ -464,43 +425,7 @@
           <w:sz w:val="16"/>
           <w:szCs w:val="16"/>
         </w:rPr>
-        <w:t xml:space="preserve">Point-Of-View based model of how a system will function </w:t>
-      </w:r>
-      <w:r>
-        <w:rPr>
-          <w:rFonts w:ascii="CMSS12" w:hAnsi="CMSS12" w:cs="CMSS12"/>
-          <w:color w:val="000000" w:themeColor="text1"/>
-          <w:sz w:val="16"/>
-          <w:szCs w:val="16"/>
-        </w:rPr>
-        <w:t>–</w:t>
-      </w:r>
-      <w:r>
-        <w:rPr>
-          <w:rFonts w:ascii="CMSS12" w:hAnsi="CMSS12" w:cs="CMSS12"/>
-          <w:color w:val="000000" w:themeColor="text1"/>
-          <w:sz w:val="16"/>
-          <w:szCs w:val="16"/>
-        </w:rPr>
-        <w:t xml:space="preserve"> Multiple</w:t>
-      </w:r>
-      <w:r>
-        <w:rPr>
-          <w:rFonts w:ascii="CMSS12" w:hAnsi="CMSS12" w:cs="CMSS12"/>
-          <w:color w:val="000000" w:themeColor="text1"/>
-          <w:sz w:val="16"/>
-          <w:szCs w:val="16"/>
-        </w:rPr>
-        <w:t xml:space="preserve"> </w:t>
-      </w:r>
-      <w:r>
-        <w:rPr>
-          <w:rFonts w:ascii="CMSS12" w:hAnsi="CMSS12" w:cs="CMSS12"/>
-          <w:color w:val="000000" w:themeColor="text1"/>
-          <w:sz w:val="16"/>
-          <w:szCs w:val="16"/>
-        </w:rPr>
-        <w:t>POVs are needed</w:t>
+        <w:t>Point-Of-View based model of how a system will function – Multiple POVs are needed</w:t>
       </w:r>
     </w:p>
     <w:p>
@@ -710,25 +635,7 @@
           <w:sz w:val="16"/>
           <w:szCs w:val="16"/>
         </w:rPr>
-        <w:t xml:space="preserve">Helps to </w:t>
-      </w:r>
-      <w:r>
-        <w:rPr>
-          <w:rFonts w:ascii="CMSS12" w:hAnsi="CMSS12" w:cs="CMSS12"/>
-          <w:color w:val="000000" w:themeColor="text1"/>
-          <w:sz w:val="16"/>
-          <w:szCs w:val="16"/>
-        </w:rPr>
-        <w:t>fin</w:t>
-      </w:r>
-      <w:r>
-        <w:rPr>
-          <w:rFonts w:ascii="CMSS12" w:hAnsi="CMSS12" w:cs="CMSS12"/>
-          <w:color w:val="000000" w:themeColor="text1"/>
-          <w:sz w:val="16"/>
-          <w:szCs w:val="16"/>
-        </w:rPr>
-        <w:t>d hidden, assumed, or implied needs</w:t>
+        <w:t>Helps to find hidden, assumed, or implied needs</w:t>
       </w:r>
     </w:p>
     <w:p>
@@ -914,25 +821,7 @@
           <w:sz w:val="16"/>
           <w:szCs w:val="16"/>
         </w:rPr>
-        <w:t>cation or how to test the</w:t>
-      </w:r>
-      <w:r>
-        <w:rPr>
-          <w:rFonts w:ascii="CMSS12" w:hAnsi="CMSS12" w:cs="CMSS12"/>
-          <w:color w:val="000000" w:themeColor="text1"/>
-          <w:sz w:val="16"/>
-          <w:szCs w:val="16"/>
-        </w:rPr>
-        <w:t xml:space="preserve"> </w:t>
-      </w:r>
-      <w:r>
-        <w:rPr>
-          <w:rFonts w:ascii="CMSS12" w:hAnsi="CMSS12" w:cs="CMSS12"/>
-          <w:color w:val="000000" w:themeColor="text1"/>
-          <w:sz w:val="16"/>
-          <w:szCs w:val="16"/>
-        </w:rPr>
-        <w:t>requirements</w:t>
+        <w:t>cation or how to test the requirements</w:t>
       </w:r>
     </w:p>
     <w:p>
@@ -951,6 +840,15 @@
     </w:p>
     <w:sdt>
       <w:sdtPr>
+        <w:rPr>
+          <w:rFonts w:asciiTheme="minorHAnsi" w:eastAsiaTheme="minorHAnsi" w:hAnsiTheme="minorHAnsi" w:cstheme="minorBidi"/>
+          <w:b w:val="0"/>
+          <w:bCs w:val="0"/>
+          <w:color w:val="auto"/>
+          <w:sz w:val="22"/>
+          <w:szCs w:val="22"/>
+          <w:lang w:eastAsia="en-US"/>
+        </w:rPr>
         <w:id w:val="303980860"/>
         <w:docPartObj>
           <w:docPartGallery w:val="Table of Contents"/>
@@ -959,12 +857,7 @@
       </w:sdtPr>
       <w:sdtEndPr>
         <w:rPr>
-          <w:rFonts w:asciiTheme="minorHAnsi" w:eastAsiaTheme="minorHAnsi" w:hAnsiTheme="minorHAnsi" w:cstheme="minorBidi"/>
           <w:noProof/>
-          <w:color w:val="auto"/>
-          <w:sz w:val="22"/>
-          <w:szCs w:val="22"/>
-          <w:lang w:eastAsia="en-US"/>
         </w:rPr>
       </w:sdtEndPr>
       <w:sdtContent>
@@ -1548,10 +1441,7 @@
     <w:p/>
     <w:p/>
     <w:p/>
-    <w:p>
-      <w:bookmarkStart w:id="0" w:name="_GoBack"/>
-      <w:bookmarkEnd w:id="0"/>
-    </w:p>
+    <w:p/>
     <w:p/>
     <w:p>
       <w:pPr>
@@ -1561,12 +1451,48 @@
           <w:numId w:val="5"/>
         </w:numPr>
       </w:pPr>
-      <w:bookmarkStart w:id="1" w:name="_Toc335908655"/>
-      <w:r>
-        <w:lastRenderedPageBreak/>
+      <w:bookmarkStart w:id="0" w:name="_Toc335908655"/>
+      <w:r>
         <w:t>Scope</w:t>
       </w:r>
+      <w:bookmarkEnd w:id="0"/>
+    </w:p>
+    <w:p>
+      <w:r>
+        <w:t xml:space="preserve">This </w:t>
+      </w:r>
+      <w:r>
+        <w:t xml:space="preserve">document is meant to define the operating environment </w:t>
+      </w:r>
+      <w:r>
+        <w:t>as it relates</w:t>
+      </w:r>
+      <w:bookmarkStart w:id="1" w:name="_GoBack"/>
       <w:bookmarkEnd w:id="1"/>
+      <w:r>
+        <w:t xml:space="preserve"> to the end-user, game developer, and server maintenance </w:t>
+      </w:r>
+      <w:r>
+        <w:t>team.</w:t>
+      </w:r>
+      <w:r>
+        <w:t xml:space="preserve"> </w:t>
+      </w:r>
+      <w:r>
+        <w:t xml:space="preserve">The Set Top Box Multiplayer Framework is currently under development by team DKM </w:t>
+      </w:r>
+      <w:r>
+        <w:rPr>
+          <w:highlight w:val="yellow"/>
+        </w:rPr>
+        <w:t>(change)</w:t>
+      </w:r>
+      <w:r>
+        <w:t xml:space="preserve"> as a Senior Design Project, under the direction of Brian Butterfield and David Springhetti of Innovative Systems L.L.C.</w:t>
+      </w:r>
+      <w:r>
+        <w:t xml:space="preserve"> </w:t>
+      </w:r>
     </w:p>
     <w:p>
       <w:pPr>
@@ -1578,6 +1504,7 @@
       </w:pPr>
       <w:bookmarkStart w:id="2" w:name="_Toc335908656"/>
       <w:r>
+        <w:lastRenderedPageBreak/>
         <w:t>Reference Documents</w:t>
       </w:r>
       <w:bookmarkEnd w:id="2"/>
@@ -3394,7 +3321,7 @@
 </file>
 
 <file path=customXml/itemProps1.xml><?xml version="1.0" encoding="utf-8"?>
-<ds:datastoreItem xmlns:ds="http://schemas.openxmlformats.org/officeDocument/2006/customXml" ds:itemID="{530D6410-BF18-4AED-AE84-4924FD22C361}">
+<ds:datastoreItem xmlns:ds="http://schemas.openxmlformats.org/officeDocument/2006/customXml" ds:itemID="{3F3549D6-22BB-4747-A2AD-2E3930F65070}">
   <ds:schemaRefs>
     <ds:schemaRef ds:uri="http://schemas.openxmlformats.org/officeDocument/2006/bibliography"/>
   </ds:schemaRefs>

</xml_diff>